<commit_message>
Revise role profile baseline for future studies
</commit_message>
<xml_diff>
--- a/01_PhD_Research_Proposal_RoleAwareHelpSeeking_20261023-1919.docx
+++ b/01_PhD_Research_Proposal_RoleAwareHelpSeeking_20261023-1919.docx
@@ -722,22 +722,30 @@
         <w:pStyle w:val="BodyText"/>
       </w:pPr>
       <w:r>
+        <w:t>Study 2 (RQ2). Evaluate several open and proprietary LLMs in a 3 × 2 design: - role information: R0 basic organizational directory (name + generic job title, optionally team/department); R1 enriched natural-language role dossier (R0 plus general duties, knowledge domains, and authority boundaries); R2 structured profile with the same semantic facts as R1; - knowledge–authority alignment: aligned / separated. R1−R0 estimates the incremental value of enriched role information over an ordinary directory; R2−R1 estimates the incremental value of structured representation. No profile may reveal task-specific answers or the gold recipient.</w:t>
+      </w:r>
+    </w:p>
+    <w:p>
+      <w:pPr>
+        <w:pStyle w:val="BodyText"/>
+      </w:pPr>
+      <w:r>
+        <w:t>Outcomes are task success, path validity, approval validity, number of queries, and interruption cost.</w:t>
+      </w:r>
+    </w:p>
+    <w:p>
+      <w:pPr>
+        <w:pStyle w:val="BodyText"/>
+      </w:pPr>
+      <w:r>
         <w:rPr>
           <w:b/>
           <w:bCs/>
         </w:rPr>
-        <w:t>Study 2 (RQ2).</w:t>
-      </w:r>
-      <w:r>
-        <w:t xml:space="preserve"> Evaluate several open and proprietary LLMs in a 3 × 2 design: - role information: names only / natural-language descriptions / structured profiles; - knowledge–authority alignment: aligned / separated.</w:t>
-      </w:r>
-    </w:p>
-    <w:p>
-      <w:pPr>
-        <w:pStyle w:val="BodyText"/>
-      </w:pPr>
-      <w:r>
-        <w:t>Outcomes are task success, path validity, approval validity, number of queries, and interruption cost.</w:t>
+        <w:t>Study 3 (RQ3).</w:t>
+      </w:r>
+      <w:r>
+        <w:t xml:space="preserve"> Vary interruption costs and authority penalties. Compare agent behavior with an oracle policy, and report regret and success–cost trade-off curves.</w:t>
       </w:r>
     </w:p>
     <w:p>
@@ -747,12 +755,11 @@
       <w:r>
         <w:rPr>
           <w:b/>
-          <w:bCs/>
-        </w:rPr>
-        <w:t>Study 3 (RQ3).</w:t>
-      </w:r>
-      <w:r>
-        <w:t xml:space="preserve"> Vary interruption costs and authority penalties. Compare agent behavior with an oracle policy, and report regret and success–cost trade-off curves.</w:t>
+        </w:rPr>
+        <w:t>Study 4 (RQ4).</w:t>
+      </w:r>
+      <w:r>
+        <w:t xml:space="preserve"> Collect trajectories under randomized help-seeking assignments. Train a lightweight open-weight policy model (7–8B) with offline reinforcement learning, using R as the reward. Compare it with prompting-based help-seeking, a sequential when-then-whom baseline, and the oracle. Test generalization on held-out organizational structures.</w:t>
       </w:r>
     </w:p>
     <w:p>
@@ -763,20 +770,6 @@
         <w:rPr>
           <w:b/>
         </w:rPr>
-        <w:t>Study 4 (RQ4).</w:t>
-      </w:r>
-      <w:r>
-        <w:t xml:space="preserve"> Collect trajectories under randomized help-seeking assignments. Train a lightweight open-weight policy model (7–8B) with offline reinforcement learning, using R as the reward. Compare it with prompting-based help-seeking, a sequential when-then-whom baseline, and the oracle. Test generalization on held-out organizational structures.</w:t>
-      </w:r>
-    </w:p>
-    <w:p>
-      <w:pPr>
-        <w:pStyle w:val="BodyText"/>
-      </w:pPr>
-      <w:r>
-        <w:rPr>
-          <w:b/>
-        </w:rPr>
         <w:t>Study 5 (RQ5).</w:t>
       </w:r>
       <w:r>
@@ -788,13 +781,7 @@
         <w:pStyle w:val="BodyText"/>
       </w:pPr>
       <w:r>
-        <w:rPr>
-          <w:b/>
-        </w:rPr>
-        <w:t xml:space="preserve">Preliminary evidence. </w:t>
-      </w:r>
-      <w:r>
-        <w:t>A pilot analysis of 390 public trajectories found that agents which contacted all required colleagues succeeded in 32% of tasks, versus 0.7% when at least one required colleague was missed. In a prototype text simulator with three tasks adapted from TheAgentCompany, providing structured role profiles reduced interruption cost by roughly two-thirds and eliminated authority violations relative to names-only prompts, while the proposed objective R separated conditions that task completion alone did not. These pilot results are small-scale and preliminary.</w:t>
+        <w:t>Preliminary evidence. A pilot analysis of 390 public trajectories found that agents which contacted all required colleagues succeeded in 32% of tasks, versus 0.7% when at least one required colleague was missed. In a prototype text simulator with three tasks adapted from TheAgentCompany, providing structured role profiles reduced interruption cost by roughly two-thirds and eliminated authority violations relative to names-only prompts, while the proposed objective R separated conditions that task completion alone did not. These pilot results are small-scale and preliminary. The names-only condition mentioned here is a historical pilot operationalization; future controlled studies use the more realistic name-and-title directory as R0 and report the contrast separately.</w:t>
       </w:r>
     </w:p>
     <w:p>

</xml_diff>